<commit_message>
Fix Portuguese accents in protein supplementation trend document
https://claude.ai/code/session_015dvxDeVpW1fYN1DVAPrAGn
</commit_message>
<xml_diff>
--- a/tendencia_proteina_personalizada.docx
+++ b/tendencia_proteina_personalizada.docx
@@ -13,7 +13,7 @@
           <w:b/>
           <w:sz w:val="32"/>
         </w:rPr>
-        <w:t>Proteina Sob Medida: Nutrigenomica e Inteligencia Artificial como Futuro da Suplementacao Proteica</w:t>
+        <w:t>Proteína Sob Medida: Nutrigenômica e Inteligência Artificial como Futuro da Suplementação Proteica</w:t>
       </w:r>
     </w:p>
     <w:p>
@@ -28,7 +28,7 @@
           <w:color w:val="808080"/>
           <w:sz w:val="22"/>
         </w:rPr>
-        <w:t>Tendencia futura - horizonte 2027-2035</w:t>
+        <w:t>Tendência futura - horizonte 2027-2035</w:t>
       </w:r>
     </w:p>
     <w:p>
@@ -42,7 +42,7 @@
           <w:b w:val="0"/>
           <w:sz w:val="22"/>
         </w:rPr>
-        <w:t>Durante decadas, a industria de suplementacao proteica funcionou com base em uma premissa simples: uma proteina serve para todos. O whey protein era prescrito com as mesmas doses e no mesmo horario para um atleta de alto rendimento e para um universitario sedentario. Esse modelo de recomendacao generica esta perto do fim. A convergencia de tres forcas tecnologicas, a nutrigenomica, a inteligencia artificial e a analise multiomics, esta construindo a infraestrutura para uma nova era: a da suplementacao proteica verdadeiramente personalizada, calibrada ao DNA, ao microbioma e ao historico metabolico de cada individuo.</w:t>
+        <w:t>Durante décadas, a indústria de suplementação proteica funcionou com base em uma premissa simples: uma proteína serve para todos. O whey protein era prescrito com as mesmas doses e no mesmo horário para um atleta de alto rendimento e para um universitário sedentário. Esse modelo de recomendação genérica está perto do fim. A convergência de três forças tecnológicas, a nutrigenômica, a inteligência artificial e a análise multiomics, está construindo a infraestrutura para uma nova era: a da suplementação proteica verdadeiramente personalizada, calibrada ao DNA, ao microbioma e ao histórico metabólico de cada indivíduo.</w:t>
       </w:r>
     </w:p>
     <w:p>
@@ -70,7 +70,7 @@
           <w:b w:val="0"/>
           <w:sz w:val="22"/>
         </w:rPr>
-        <w:t>A variabilidade individual na resposta a proteina dietetica e amplamente documentada na literatura cientifica, mas raramente incorporada na pratica de prescricao. Individuos com o mesmo peso corporal, o mesmo nivel de atividade fisica e o mesmo protocolo de treino podem apresentar respostas completamente distintas ao consumo de whey protein ou caseina, tanto na sintese proteica muscular quanto na distribuicao de aminoacidos no plasma. Estudos publicados no PMC e na Frontiers in Nutrition demonstram que essa variabilidade e em parte determinada geneticamente, com polimorfismos de nucleotideo unico (SNPs) influenciando diretamente a absorcao, o metabolismo e a utilizacao de aminoacidos essenciais.</w:t>
+        <w:t>A variabilidade individual na resposta à proteína dietética é amplamente documentada na literatura científica, mas raramente incorporada na prática de prescrição. Indivíduos com o mesmo peso corporal, o mesmo nível de atividade física e o mesmo protocolo de treino podem apresentar respostas completamente distintas ao consumo de whey protein ou caseína, tanto na síntese proteica muscular quanto na distribuição de aminoácidos no plasma. Estudos publicados no PMC e na Frontiers in Nutrition demonstram que essa variabilidade é em parte determinada geneticamente, com polimorfismos de nucleotídeo único (SNPs) influenciando diretamente a absorção, o metabolismo e a utilização de aminoácidos essenciais.</w:t>
       </w:r>
     </w:p>
     <w:p>
@@ -84,7 +84,7 @@
           <w:b/>
           <w:sz w:val="22"/>
         </w:rPr>
-        <w:t>A base genetica da resposta proteica</w:t>
+        <w:t>A base genética da resposta proteica</w:t>
       </w:r>
     </w:p>
     <w:p>
@@ -98,7 +98,7 @@
           <w:b w:val="0"/>
           <w:sz w:val="22"/>
         </w:rPr>
-        <w:t>Tres genes se destacam na interface entre genetica e metabolismo proteico. O gene ACTN3, frequentemente chamado de gene da velocidade, codifica a alfa-actinina-3, proteina estrutural das fibras musculares de contracao rapida. Individuos portadores do genotipo RR apresentam maior densidade de fibras do tipo II e respondem de forma mais robusta a suplementacao com proteinas de alto valor biologico, como o whey protein, especialmente quando combinadas com leucina. Ja portadores do genotipo XX, que carecem de alfa-actinina-3 funcional, tendem a apresentar perfil de fibras musculares mais oxidativas e podem se beneficiar mais de proteinas com liberacao lenta, como a caseina. Uma revisao sistematica e meta-analise publicada no Journal of Innovative and Creativity em 2025, que compilou estudos com 2.530 atletas de forca e 6.652 controles, confirmou o papel do ACTN3 na determinacao do perfil de performance e, por extensao, da resposta ao suporte nutricional proteico.</w:t>
+        <w:t>Três genes se destacam na interface entre genética e metabolismo proteico. O gene ACTN3, frequentemente chamado de gene da velocidade, codifica a alfa-actinina-3, proteína estrutural das fibras musculares de contração rápida. Indivíduos portadores do genótipo RR apresentam maior densidade de fibras do tipo II e respondem de forma mais robusta à suplementação com proteínas de alto valor biológico, como o whey protein, especialmente quando combinadas com leucina. Já portadores do genótipo XX, que carecem de alfa-actinina-3 funcional, tendem a apresentar perfil de fibras musculares mais oxidativas e podem se beneficiar mais de proteínas com liberação lenta, como a caseína. Uma revisão sistemática e meta-análise publicada no Journal of Innovative and Creativity em 2025, que compilou estudos com 2.530 atletas de força e 6.652 controles, confirmou o papel do ACTN3 na determinação do perfil de performance e, por extensão, da resposta ao suporte nutricional proteico.</w:t>
       </w:r>
     </w:p>
     <w:p>
@@ -112,7 +112,7 @@
           <w:b w:val="0"/>
           <w:sz w:val="22"/>
         </w:rPr>
-        <w:t>O gene ACE, responsavel pela codificacao da enzima conversora de angiotensina, modula a eficiencia cardiovascular e muscular. O polimorfismo ACE DD esta associado a maior hipertrofia em resposta ao treino de resistencia, enquanto o ACE II apresenta vantagens em modalidades de endurance. Esses perfis geneticos implicam estrategias de suplementacao proteica distintas: atletas DD tendem a se beneficiar de protocolos hipoproteicos sazonais com ciclagem de aminoacidos de cadeia ramificada (BCAAs), enquanto atletas II necessitam de aporte proteico mais consistente ao longo do dia para sustentar a recuperacao muscular em cargas de volume elevado. O gene PPARGC1A, que codifica o regulador mestre da biogenese mitocondrial PGC-1alfa, completa esse triduo: seus polimorfismos afetam diretamente a forma como o organismo utiliza proteina como substrato energetico versus anabolico, o que tem implicacoes diretas para o momento e o tipo de suplemento proteico mais eficaz para cada individuo.</w:t>
+        <w:t>O gene ACE, responsável pela codificação da enzima conversora de angiotensina, modula a eficiência cardiovascular e muscular. O polimorfismo ACE DD está associado a maior hipertrofia em resposta ao treino de resistência, enquanto o ACE II apresenta vantagens em modalidades de endurance. Esses perfis genéticos implicam estratégias de suplementação proteica distintas: atletas DD tendem a se beneficiar de protocolos com ciclagem de aminoácidos de cadeia ramificada (BCAAs), enquanto atletas II necessitam de aporte proteico mais consistente ao longo do dia para sustentar a recuperação muscular em cargas de volume elevado. O gene PPARGC1A, que codifica o regulador mestre da biogênese mitocondrial PGC-1alfa, completa esse tríduo: seus polimorfismos afetam diretamente a forma como o organismo utiliza proteína como substrato energético versus anabólico, o que tem implicações diretas para o momento e o tipo de suplemento proteico mais eficaz para cada indivíduo.</w:t>
       </w:r>
     </w:p>
     <w:p>
@@ -126,7 +126,7 @@
           <w:b/>
           <w:sz w:val="22"/>
         </w:rPr>
-        <w:t>A revolucao multiomics: alem do DNA</w:t>
+        <w:t>A revolução multiomics: além do DNA</w:t>
       </w:r>
     </w:p>
     <w:p>
@@ -140,7 +140,7 @@
           <w:b w:val="0"/>
           <w:sz w:val="22"/>
         </w:rPr>
-        <w:t>A nutrigenomica de segunda geracao nao se limita ao genoma. Ela integra dados de pelo menos quatro camadas biologicas simultaneamente: genomica (variantes geneticas herdadas), metabolomica (compostos circulantes no sangue e urina que refletem o metabolismo em tempo real), proteômica (perfil de proteinas expressas no organismo) e microbioma intestinal (composicao da flora bacteriana do intestino). Uma revisao publicada no Genes &amp; Nutrition (PMC) em 2025, desenvolvida por pesquisadores de multiplas universidades, demonstrou que modelos computacionais capazes de integrar essas quatro camadas de dados atingiram acuracia superior a 90% na predicao de respostas metabolicas individuais a intervencoes dieteticas, incluindo suplementacao proteica. Isso representa um salto qualitativo em relacao aos modelos geneticos isolados, cuja acuracia tipicamente ficava abaixo de 75%.</w:t>
+        <w:t>A nutrigenômica de segunda geração não se limita ao genoma. Ela integra dados de pelo menos quatro camadas biológicas simultaneamente: genômica (variantes genéticas herdadas), metabolômica (compostos circulantes no sangue e urina que refletem o metabolismo em tempo real), proteômica (perfil de proteínas expressas no organismo) e microbioma intestinal (composição da flora bacteriana do intestino). Uma revisão publicada no Genes &amp; Nutrition (PMC) em 2025, desenvolvida por pesquisadores de múltiplas universidades, demonstrou que modelos computacionais capazes de integrar essas quatro camadas de dados atingiram acurácia superior a 90% na predição de respostas metabólicas individuais a intervenções dietéticas, incluindo suplementação proteica. Isso representa um salto qualitativo em relação aos modelos genéticos isolados, cuja acurácia tipicamente ficava abaixo de 75%.</w:t>
       </w:r>
     </w:p>
     <w:p>
@@ -154,7 +154,7 @@
           <w:b w:val="0"/>
           <w:sz w:val="22"/>
         </w:rPr>
-        <w:t>O papel do microbioma nesse contexto merece atencao especial. Pesquisas publicadas entre 2023 e 2025 demonstraram que a composicao da microbiota intestinal influencia significativamente a digestao e a absorcao de proteinas dieteticas. Bacterias do genero Bifidobacterium e Lactobacillus, por exemplo, modulam a producao de aminoacidos a partir de proteinas ingeridas, afetando a biodisponibilidade efetiva de suplementos proteicos de forma que varia substancialmente entre individuos. Esse achado sugere que dois consumidores com o mesmo perfil genetico e a mesma dose de whey protein podem absorver quantidades significativamente diferentes de leucina biodisponivel, simplesmente em funcao da composicao de sua flora intestinal.</w:t>
+        <w:t>O papel do microbioma nesse contexto merece atenção especial. Pesquisas publicadas entre 2023 e 2025 demonstraram que a composição da microbiota intestinal influencia significativamente a digestão e a absorção de proteínas dietéticas. Bactérias do gênero Bifidobacterium e Lactobacillus, por exemplo, modulam a produção de aminoácidos a partir de proteínas ingeridas, afetando a biodisponibilidade efetiva de suplementos proteicos de forma que varia substancialmente entre indivíduos. Esse achado sugere que dois consumidores com o mesmo perfil genético e a mesma dose de whey protein podem absorver quantidades significativamente diferentes de leucina biodisponível, simplesmente em função da composição de sua flora intestinal.</w:t>
       </w:r>
     </w:p>
     <w:p>
@@ -168,7 +168,7 @@
           <w:b/>
           <w:sz w:val="22"/>
         </w:rPr>
-        <w:t>Inteligencia artificial como motor da personalizacao</w:t>
+        <w:t>Inteligência artificial como motor da personalização</w:t>
       </w:r>
     </w:p>
     <w:p>
@@ -182,7 +182,7 @@
           <w:b w:val="0"/>
           <w:sz w:val="22"/>
         </w:rPr>
-        <w:t>A inteligencia artificial e o elemento que torna a nutrigenomica escalavel e comercialmente viavel. Sem IA, a analise integrada de dados genomicos, metabolomicos e do microbioma seria um processo laboratorial lento, caro e inacessivel para o consumidor comum. Com IA, o que antes demandava meses de analise laboratorial pode ser processado em horas, gerando recomendacoes proteicas personalizadas entregues diretamente ao aplicativo do consumidor. A publicacao mais emblematica nesse campo em 2025 veio da Nature Scientific Reports: um estudo desenvolvido na interface entre ciencia do esporte e machine learning construiu um framework preditivo baseado em redes adversariais generativas para recomendar suplementacao individualizada de carboidrato e proteina para atletas de endurance, utilizando 231 ensaios com 46 variaveis de entrada cobrindo caracteristicas basais e ingestas dieteticas. O modelo demonstrou capacidade de capturar padroes individuais de resposta que modelos convencionais baseados em medias populacionais nao conseguiam detectar.</w:t>
+        <w:t>A inteligência artificial é o elemento que torna a nutrigenômica escalável e comercialmente viável. Sem IA, a análise integrada de dados genômicos, metabolômicos e do microbioma seria um processo laboratorial lento, caro e inacessível para o consumidor comum. Com IA, o que antes demandava meses de análise laboratorial pode ser processado em horas, gerando recomendações proteicas personalizadas entregues diretamente ao aplicativo do consumidor. A publicação mais emblemática nesse campo em 2025 veio da Nature Scientific Reports: um estudo desenvolvido na interface entre ciência do esporte e machine learning construiu um framework preditivo baseado em redes adversariais generativas para recomendar suplementação individualizada de carboidrato e proteína para atletas de endurance, utilizando 231 ensaios com 46 variáveis de entrada cobrindo características basais e ingestas dietéticas. O modelo demonstrou capacidade de capturar padrões individuais de resposta que modelos convencionais baseados em médias populacionais não conseguiam detectar.</w:t>
       </w:r>
     </w:p>
     <w:p>
@@ -196,7 +196,7 @@
           <w:b w:val="0"/>
           <w:sz w:val="22"/>
         </w:rPr>
-        <w:t>Outra publicacao relevante de 2025, publicada no American Journal of Clinical Nutrition, enfatizou que a IA nao apenas melhora a precisao das recomendacoes nutricionais, mas tambem resolve um dos maiores gargalos da nutricao de precisao: a coleta de dados dieteticos. Modelos de visao computacional integrados a wearables permitem estimar o consumo proteico diario com acuracia similar a pesagem direta de alimentos, eliminando a dependencia de recordatorios alimentares sujeitos a vieses de auto-relato. Na Universidade Estadual do Arizona, pesquisadores desenvolveram o sistema MealMeter, que combina dados fisiologicos (frequencia cardiaca, glicose sanguinea), dados de movimentacao e sinais ambientais para modelar respostas metabolicas pos-refeicao em tempo real, incluindo a resposta individual a diferentes tipos de proteina ingerida.</w:t>
+        <w:t>Outra publicação relevante de 2025, publicada no American Journal of Clinical Nutrition, enfatizou que a IA não apenas melhora a precisão das recomendações nutricionais, mas também resolve um dos maiores gargalos da nutrição de precisão: a coleta de dados dietéticos. Modelos de visão computacional integrados a wearables permitem estimar o consumo proteico diário com acurácia similar à pesagem direta de alimentos, eliminando a dependência de recordatórios alimentares sujeitos a vieses de auto-relato. Na Universidade Estadual do Arizona, pesquisadores desenvolveram o sistema MealMeter, que combina dados fisiológicos (frequência cardíaca, glicose sanguínea), dados de movimentação e sinais ambientais para modelar respostas metabólicas pós-refeição em tempo real, incluindo a resposta individual a diferentes tipos de proteína ingerida.</w:t>
       </w:r>
     </w:p>
     <w:p>
@@ -210,7 +210,7 @@
           <w:b/>
           <w:sz w:val="22"/>
         </w:rPr>
-        <w:t>O mercado em formacao</w:t>
+        <w:t>O mercado em formação</w:t>
       </w:r>
     </w:p>
     <w:p>
@@ -224,7 +224,7 @@
           <w:b w:val="0"/>
           <w:sz w:val="22"/>
         </w:rPr>
-        <w:t>O potencial economico dessa convergencia e expressivo. O mercado global de nutricao personalizada foi avaliado em USD 15,80 bilhoes em 2025 e deve atingir USD 60,92 bilhoes ate 2035, crescendo a uma taxa composta de 15,04% ao ano, segundo dados do GlobeNewswire (2026). Dentro desse segmento, o mercado especifico de nutricao personalizada baseada em IA crescera ainda mais rapidamente: de USD 1,59 bilhao em 2025 para USD 17,72 bilhoes em 2035, a uma CAGR de 27,4%, conforme o InsightAce Analytic. O segmento de suplementos e nutraceuticos representa a fatia dominante desse mercado, com aproximadamente 42,36% da participacao de receita em 2025, segundo o SNS Insider, refletindo o apetite dos consumidores por solucoes de suplementacao que sejam ao mesmo tempo baseadas em ciencia e adaptadas ao seu perfil unico.</w:t>
+        <w:t>O potencial econômico dessa convergência é expressivo. O mercado global de nutrição personalizada foi avaliado em USD 15,80 bilhões em 2025 e deve atingir USD 60,92 bilhões até 2035, crescendo a uma taxa composta de 15,04% ao ano, segundo dados do GlobeNewswire (2026). Dentro desse segmento, o mercado específico de nutrição personalizada baseada em IA crescerá ainda mais rapidamente: de USD 1,59 bilhão em 2025 para USD 17,72 bilhões em 2035, a uma CAGR de 27,4%, conforme o InsightAce Analytic. O segmento de suplementos e nutraceuticos representa a fatia dominante desse mercado, com aproximadamente 42,36% da participação de receita em 2025, segundo o SNS Insider, refletindo o apetite dos consumidores por soluções de suplementação que sejam ao mesmo tempo baseadas em ciência e adaptadas ao seu perfil único.</w:t>
       </w:r>
     </w:p>
     <w:p>
@@ -238,7 +238,7 @@
           <w:b w:val="0"/>
           <w:sz w:val="22"/>
         </w:rPr>
-        <w:t>O mercado especifico de nutrigenomica, que inclui testes geneticos aplicados a nutricao, esta saindo de uma fase de nicho para uma fase de crescimento acelerado: avaliado em USD 613 milhoes em 2025, deve atingir USD 2,62 bilhoes ate 2034, crescendo a 17,52% ao ano, segundo a Precedence Research. O segmento de DNA digitalizado, que integra resultados de testes geneticos diretos ao consumidor (como os kits de coleta de saliva em casa) com plataformas digitais de recomendacao nutricional, crescera ainda mais rapido: a 17,82% ao ano entre 2026 e 2035. Esse dado reflete a entrada de players como Genova Diagnostics, Nutrigenomix e startups de tecnologia em saude que estao construindo pipelines end-to-end, do swab de saliva ao suplemento proteico formulado sob encomenda.</w:t>
+        <w:t>O mercado específico de nutrigenômica, que inclui testes genéticos aplicados à nutrição, está saindo de uma fase de nicho para uma fase de crescimento acelerado: avaliado em USD 613 milhões em 2025, deve atingir USD 2,62 bilhões até 2034, crescendo a 17,52% ao ano, segundo a Precedence Research. O segmento de DNA digitalizado, que integra resultados de testes genéticos diretos ao consumidor com plataformas digitais de recomendação nutricional, crescerá ainda mais rápido: a 17,82% ao ano entre 2026 e 2035. Esse dado reflete a entrada de players como Genova Diagnostics, Nutrigenomix e startups de tecnologia em saúde que estão construindo pipelines end-to-end, do swab de saliva ao suplemento proteico formulado sob encomenda.</w:t>
       </w:r>
     </w:p>
     <w:p>
@@ -252,7 +252,7 @@
           <w:b w:val="0"/>
           <w:sz w:val="22"/>
         </w:rPr>
-        <w:t>Grandes ensaios clinicos globais ja validaram a eficacia superior da abordagem personalizada sobre as recomendacoes genericas. Os estudos PREDICT, FOOD4ME e PRECISION-HEALTH, compilados em revisao publicada em 2025, demonstraram melhorias significativas em controle glicemico, gestao de peso e adesao dietetica em grupos que receberam recomendacoes nutricionais personalizadas baseadas em dados multiomics em comparacao com grupos de controle que seguiram guidelines nutricionais convencionais. O estudo FOOD4ME, especificamente conduzido em oito paises europeus com mais de 1.200 participantes, mostrou que a personalizacao baseada em dados genomicos e fenomenos metabolicos levou a melhorias significativamente maiores na qualidade da dieta e na ingestao proteica adequada em comparacao com conselhos dieteticos genericos.</w:t>
+        <w:t>Grandes ensaios clínicos globais já validaram a eficácia superior da abordagem personalizada sobre as recomendações genéricas. Os estudos PREDICT, FOOD4ME e PRECISION-HEALTH, compilados em revisão publicada em 2025, demonstraram melhorias significativas em controle glicêmico, gestão de peso e adesão dietética em grupos que receberam recomendações nutricionais personalizadas baseadas em dados multiomics em comparação com grupos de controle que seguiram guidelines nutricionais convencionais. O estudo FOOD4ME, especificamente conduzido em oito países europeus com mais de 1.200 participantes, mostrou que a personalização baseada em dados genômicos e fenômenos metabólicos levou a melhorias significativamente maiores na qualidade da dieta e na ingestão proteica adequada em comparação com conselhos dietéticos genéricos.</w:t>
       </w:r>
     </w:p>
     <w:p>
@@ -266,7 +266,7 @@
           <w:b/>
           <w:sz w:val="22"/>
         </w:rPr>
-        <w:t>Implicacoes para a industria de suplementos proteicos</w:t>
+        <w:t>Implicações para a indústria de suplementos proteicos</w:t>
       </w:r>
     </w:p>
     <w:p>
@@ -280,7 +280,7 @@
           <w:b w:val="0"/>
           <w:sz w:val="22"/>
         </w:rPr>
-        <w:t>A transicao para a suplementacao proteica personalizada nao e apenas uma oportunidade de mercado: e uma pressao competitiva crescente sobre os players tradicionais. Marcas que hoje competem primariamente por preco ou sabor de seus whey proteins precisarao, nos proximos cinco a oito anos, integrar capacidades de analise de dados ou estabelecer parcerias com plataformas de nutrigenomica para manter relevancia. O modelo de negocio emergente nao e o de um produto vendido em prateleira, mas o de uma assinatura de protocolo proteico que se ajusta trimestralmente conforme a evolucao dos biomarcadores do consumidor, seus objetivos e a resposta documentada ao suplemento anterior. Empresas como Persona Nutrition, Baze e Care/of ja operam em versoes embrionarias desse modelo, mas ainda sem a integracao genomica e metabolomica que caracterizara a proxima geracao de servicos.</w:t>
+        <w:t>A transição para a suplementação proteica personalizada não é apenas uma oportunidade de mercado: é uma pressão competitiva crescente sobre os players tradicionais. Marcas que hoje competem primariamente por preço ou sabor de seus whey proteins precisarão, nos próximos cinco a oito anos, integrar capacidades de análise de dados ou estabelecer parcerias com plataformas de nutrigenômica para manter relevância. O modelo de negócio emergente não é o de um produto vendido em prateleira, mas o de uma assinatura de protocolo proteico que se ajusta trimestralmente conforme a evolução dos biomarcadores do consumidor, seus objetivos e a resposta documentada ao suplemento anterior. Empresas como Persona Nutrition, Baze e Care/of já operam em versões embrionárias desse modelo, mas ainda sem a integração genômica e metabolômica que caracterizará a próxima geração de serviços.</w:t>
       </w:r>
     </w:p>
     <w:p>
@@ -294,7 +294,7 @@
           <w:b/>
           <w:sz w:val="22"/>
         </w:rPr>
-        <w:t>SINTESE</w:t>
+        <w:t>SÍNTESE</w:t>
       </w:r>
     </w:p>
     <w:p>
@@ -308,7 +308,7 @@
           <w:b w:val="0"/>
           <w:sz w:val="22"/>
         </w:rPr>
-        <w:t>A suplementacao proteica personalizada nao e uma promessa distante de laboratorio. E a convergencia de tres campos ja maduros, a genetica nutricional, a analise computacional de dados biologicos e a inteligencia artificial, que estao se encontrando no momento em que o custo de testes genomicos e processamento de dados atingiu niveis acessiveis ao consumidor final. O mercado global responde a esse sinal com taxas de crescimento que superam qualquer segmento tradicional da industria de suplementos. A questao que o setor precisa responder nos proximos anos nao e se a personalizacao proteica vai acontecer, mas quem construira a infraestrutura para entrega-la em escala, e se a industria brasileira, ja 15o mercado global de suplementos, conseguira capturar essa transformacao antes que ela seja importada de fora.</w:t>
+        <w:t>A suplementação proteica personalizada não é uma promessa distante de laboratório. É a convergência de três campos já maduros, a genética nutricional, a análise computacional de dados biológicos e a inteligência artificial, que estão se encontrando no momento em que o custo de testes genômicos e processamento de dados atingiu níveis acessíveis ao consumidor final. O mercado global responde a esse sinal com taxas de crescimento que superam qualquer segmento tradicional da indústria de suplementos. A questão que o setor precisa responder nos próximos anos não é se a personalização proteica vai acontecer, mas quem construirá a infraestrutura para entregá-la em escala, e se a indústria brasileira, já 15° mercado global de suplementos, conseguirá capturar essa transformação antes que ela seja importada de fora.</w:t>
       </w:r>
     </w:p>
     <w:p>
@@ -322,7 +322,7 @@
           <w:b/>
           <w:sz w:val="22"/>
         </w:rPr>
-        <w:t>Referencias:</w:t>
+        <w:t>Referências:</w:t>
       </w:r>
     </w:p>
     <w:p>

</xml_diff>